<commit_message>
Analyseer ruimtelijke representativiteit van PQs
</commit_message>
<xml_diff>
--- a/analyses/broedvogel_vegetatie_power/ANALYSE_HOOFDLIJNEN_EN_UITKOMSTEN.docx
+++ b/analyses/broedvogel_vegetatie_power/ANALYSE_HOOFDLIJNEN_EN_UITKOMSTEN.docx
@@ -21,17 +21,7 @@
         <w:keepLines w:val="0"/>
       </w:pPr>
       <w:r>
-        <w:rPr>
-          <w:rFonts w:ascii="Arial" w:hAnsi="Arial" w:eastAsia="Arial"/>
-          <w:b/>
-        </w:rPr>
-        <w:t>Stand:</w:t>
-      </w:r>
-      <w:r>
-        <w:rPr>
-          <w:rFonts w:ascii="Arial" w:hAnsi="Arial" w:eastAsia="Arial"/>
-        </w:rPr>
-        <w:t xml:space="preserve"> 28 oktober 2026</w:t>
+        <w:t>Stand: 29 oktober 2026</w:t>
       </w:r>
     </w:p>
     <w:p>
@@ -143,6 +133,12 @@
           <w:rFonts w:ascii="Arial" w:hAnsi="Arial" w:eastAsia="Arial"/>
         </w:rPr>
         <w:t>De analyse is daarna uitgebreid met ecologisch specifiekere structuur. De landbedekkingskaarten van 2001 en 2022 geven voor 25 plots informatie over open zand, lage vegetatie, struweel, bomen, riet en water. Wateroppervlak levert het duidelijkste ruimtelijke signaal voor watervogels. Twee kaartmomenten zijn echter onvoldoende om vast te stellen wanneer de verandering plaatsvond of om een algemene vogelreactie door de tijd te voorspellen. De AHN2–AHN5-reeks levert voor 55 plots vier geharmoniseerde hoogtemomenten tussen 2008 en 2023. Alleen het boomgroepmodel kon de tijdstoets numeriek doorlopen; de geringe verbetering verdween bij het weglaten van één soort. AHN1 bleek te methodegevoelig om als vergelijkbaar vijfde moment te gebruiken. De proef met tien openbare luchtfoto's uit 2016–2024 bleef met een macro-F1 van 0,420–0,469 onder de vooraf gekozen grens van 0,60. Daaruit is daarom geen jaarlijkse vegetatiestructuurreeks afgeleid.</w:t>
+      </w:r>
+    </w:p>
+    <w:p>
+      <w:pPr/>
+      <w:r>
+        <w:t>De aanvullende representativiteitsanalyse laat zien dat de landbedekkingsklassen waarin minstens één PQ ligt binnen de 25 kaartplots per plot mediaan 47,2% van het oppervlak in 2001 en 58,4% in 2022 beslaan. Dat is klassedekking: de ruimtelijke spreiding van de PQ’s binnen zo’n klasse is hiermee niet getoetst. Oppervlakteweging kan de verdeling tussen bemonsterde klassen corrigeren, maar niet de ontbrekende klassen. Daarom is nog geen gewogen algemeen vogelmodel geschat.</w:t>
       </w:r>
     </w:p>
     <w:p>
@@ -2757,6 +2753,50 @@
           <w:rFonts w:ascii="Arial" w:hAnsi="Arial" w:eastAsia="Arial"/>
         </w:rPr>
         <w:t>Per plot en klasse zijn nu ook aantal en dichtheid van aaneengesloten vlakken, aandeel van het grootste vlak en randdichtheid berekend. Per plot zijn klassenrijkdom, Shannon-diversiteit en totale interne randdichtheid bepaald. Tussen 2001 en 2022 stijgt de mediane interne randdichtheid over de 25 plots met 49,0 meter per hectare en de mediane Shannon-diversiteit met 0,049; de mediane klassenrijkdom verandert niet. Dat zijn beschrijvende veranderingen in het kaartpatroon. Met twee meetmomenten bewijzen zij geen ecologische oorzaak en leveren zij nog geen tijdsvalidatie voor vogelverandering.</w:t>
+      </w:r>
+    </w:p>
+    <w:p>
+      <w:pPr>
+        <w:pStyle w:val="Heading3"/>
+      </w:pPr>
+      <w:r>
+        <w:t>Representativiteit van de PQ’s binnen de kaartplots</w:t>
+      </w:r>
+    </w:p>
+    <w:p>
+      <w:pPr/>
+      <w:r>
+        <w:t>Op 29 oktober 2026 is voor dezelfde 25 kaartplots formeel vergeleken welk aandeel van iedere landbedekkingsklasse aanwezig is en welk aandeel van de PQ’s daarin ligt. Per kaartjaar is van ieder PQ de dichtstbijzijnde opname binnen vijf jaar gebruikt. De werkelijke RD-coördinaat is rechtstreeks in het raster van 2001 of 2022 bemonsterd. Voor 2001 zijn 84 PQ’s geselecteerd, waarvan 82 op een bruikbare rasterklasse liggen; voor 2022 zijn dit 102 en 100. Het samengestelde historische plot M17 is via de bestaande genormaliseerde koppeling als plot_id 999995 behandeld en niet verward met M17a (plot_id 3513).</w:t>
+      </w:r>
+    </w:p>
+    <w:p>
+      <w:pPr/>
+      <w:r>
+        <w:t>In 2001 bevatten 18 van de 25 kaartplots minstens één bruikbaar PQ; in 2022 zijn dit er 19. De vegetatieklassen waarin werkelijk een PQ ligt beslaan per plot mediaan 47,2% van het oppervlak in 2001 en 58,4% in 2022. Gemiddeld is dit respectievelijk 44,4% en 44,8%. Dit is klassedekking: zodra in een klasse één PQ ligt, telt het volledige oppervlakteaandeel van die klasse mee. De ruimtelijke spreiding en de representativiteit binnen die klasse zijn hiermee niet vastgesteld. Bij een verkennende minimumvoorwaarde van minstens drie PQ’s en minstens 70% klassedekking blijven slechts acht plots in 2001 en negen in 2022 over. Dit is geen nieuwe formele geldigheidsgrens, maar maakt zichtbaar hoeveel plots zelfs voor een beperkte gewogen proef voldoende steun hebben.</w:t>
+      </w:r>
+    </w:p>
+    <w:p>
+      <w:pPr/>
+      <w:r>
+        <w:t>Over alle 25 kaartplots samen is in 2001 vooral boomgroep onderbemonsterd: 9,8% van het oppervlak tegenover 1,2% van de bruikbare PQ’s. Water beslaat 6,3% tegenover 2,4% van de PQ’s en riet 2,6% tegenover 1,2%. Lage vegetatie en struweel zijn juist oververtegenwoordigd. In 2022 is de grootste afwijking water: 8,0% van het oppervlak tegenover 1,0% van de PQ’s. Struweel is dan 23,2% van het oppervlak en 28,0% van de PQ’s. Bos, boomgroepen en lage vegetatie liggen gebiedsbreed dichter bij hun oppervlakteaandeel, maar binnen afzonderlijke plots blijven de verschillen groot.</w:t>
+      </w:r>
+    </w:p>
+    <w:p>
+      <w:pPr/>
+      <w:r>
+        <w:t>De bestaande vijf Meijendel-deelgebieden zijn als tweede laag gebruikt. De 25 kaartplots omvatten zes plots in Buitenduin Noord, één in Buitenduin Zuid, elf in Kijfhoek en Bierlap, drie in Vallei Meijendel en vier in de Zuid-oosthoek. De uitkomsten per deelgebied beschrijven daarom alleen deze 25 kaartplots. Vooral Buitenduin Zuid, met uitsluitend M17b, kan niet als steekproef van het volledige zuidelijke buitenduin worden gelezen.</w:t>
+      </w:r>
+    </w:p>
+    <w:p>
+      <w:pPr/>
+      <w:r>
+        <w:t>Voor iedere bemonsterde klasse is een voorlopig oppervlaktegewicht berekend: het klasseaandeel gedeeld door het aantal PQ’s in die klasse, daarna binnen het bemonsterde deel van het plot genormaliseerd. Een aanwezige klasse zonder PQ blijft echter ongedekt. De gewichten kunnen dus scheve verdeling binnen het bemonsterde deel corrigeren, maar niet de ontbrekende 41–53% van een mediaan plot reconstrueren. Daarom is met deze gewichten nog geen nieuw vogelmodel geschat. Dat zou voor de volledige 25 of 52 plots een nauwkeurigheid suggereren die de PQ-dekking niet levert. De negatieve modelpoort en alle plot-, klasse- en deelgebiedsuitkomsten zijn wel reproduceerbaar vastgelegd.</w:t>
+      </w:r>
+    </w:p>
+    <w:p>
+      <w:pPr/>
+      <w:r>
+        <w:t>De verwachte Dunea-luchtfoto’s blijven voor het vervolg belangrijk. Zij kunnen de horizontale vegetatiestructuur gebiedsdekkend en op meer historische momenten beschrijven, ook in plots en klassen zonder PQ. Zij maken de PQ’s niet alsnog gebiedsdekkend voor plantensoortensamenstelling. De definitieve vogelmodelvergelijking wordt bovendien na de gevalideerde import van BMP 2026 opnieuw uitgevoerd, zodat 2026 niet via een afzonderlijke noodroute wordt toegevoegd.</w:t>
       </w:r>
     </w:p>
     <w:p>
@@ -7486,6 +7526,86 @@
               <w:insideH w:val="single" w:sz="6" w:color="D9D9D9"/>
               <w:insideV w:val="single" w:sz="6" w:color="D9D9D9"/>
             </w:tcBorders>
+          </w:tcPr>
+          <w:p>
+            <w:r>
+              <w:t>Representativiteit PQ’s binnen kaartplots</w:t>
+            </w:r>
+          </w:p>
+        </w:tc>
+        <w:tc>
+          <w:tcPr>
+            <w:tcW w:type="dxa" w:w="1876"/>
+            <w:vAlign w:val="center"/>
+            <w:tcMar>
+              <w:top w:w="90" w:type="dxa"/>
+              <w:start w:w="100" w:type="dxa"/>
+              <w:bottom w:w="90" w:type="dxa"/>
+              <w:end w:w="100" w:type="dxa"/>
+            </w:tcMar>
+            <w:tcBorders>
+              <w:top w:val="single" w:sz="6" w:color="D9D9D9"/>
+              <w:left w:val="single" w:sz="6" w:color="D9D9D9"/>
+              <w:bottom w:val="single" w:sz="6" w:color="D9D9D9"/>
+              <w:right w:val="single" w:sz="6" w:color="D9D9D9"/>
+              <w:insideH w:val="single" w:sz="6" w:color="D9D9D9"/>
+              <w:insideV w:val="single" w:sz="6" w:color="D9D9D9"/>
+            </w:tcBorders>
+          </w:tcPr>
+          <w:p>
+            <w:r>
+              <w:t>Uitgevoerd; geen algemeen gewogen model</w:t>
+            </w:r>
+          </w:p>
+        </w:tc>
+        <w:tc>
+          <w:tcPr>
+            <w:tcW w:type="dxa" w:w="6003"/>
+            <w:vAlign w:val="center"/>
+            <w:tcMar>
+              <w:top w:w="90" w:type="dxa"/>
+              <w:start w:w="100" w:type="dxa"/>
+              <w:bottom w:w="90" w:type="dxa"/>
+              <w:end w:w="100" w:type="dxa"/>
+            </w:tcMar>
+            <w:tcBorders>
+              <w:top w:val="single" w:sz="6" w:color="D9D9D9"/>
+              <w:left w:val="single" w:sz="6" w:color="D9D9D9"/>
+              <w:bottom w:val="single" w:sz="6" w:color="D9D9D9"/>
+              <w:right w:val="single" w:sz="6" w:color="D9D9D9"/>
+              <w:insideH w:val="single" w:sz="6" w:color="D9D9D9"/>
+              <w:insideV w:val="single" w:sz="6" w:color="D9D9D9"/>
+            </w:tcBorders>
+          </w:tcPr>
+          <w:p>
+            <w:r>
+              <w:t>In 2001 liggen 82 bruikbare PQ’s in 18 van 25 plots en in 2022 100 in 19 plots. Klassen met minstens één PQ beslaan per plot mediaan 47,2% en 58,4% van het oppervlak; de spreiding binnen die klassen is niet getoetst. Weging corrigeert scheefheid tussen bemonsterde klassen, maar vult ontbrekende klassen niet aan.</w:t>
+            </w:r>
+          </w:p>
+        </w:tc>
+      </w:tr>
+      <w:tr>
+        <w:trPr>
+          <w:cantSplit/>
+        </w:trPr>
+        <w:tc>
+          <w:tcPr>
+            <w:tcW w:type="dxa" w:w="2000"/>
+            <w:vAlign w:val="center"/>
+            <w:tcMar>
+              <w:top w:w="90" w:type="dxa"/>
+              <w:start w:w="100" w:type="dxa"/>
+              <w:bottom w:w="90" w:type="dxa"/>
+              <w:end w:w="100" w:type="dxa"/>
+            </w:tcMar>
+            <w:tcBorders>
+              <w:top w:val="single" w:sz="6" w:color="D9D9D9"/>
+              <w:left w:val="single" w:sz="6" w:color="D9D9D9"/>
+              <w:bottom w:val="single" w:sz="6" w:color="D9D9D9"/>
+              <w:right w:val="single" w:sz="6" w:color="D9D9D9"/>
+              <w:insideH w:val="single" w:sz="6" w:color="D9D9D9"/>
+              <w:insideV w:val="single" w:sz="6" w:color="D9D9D9"/>
+            </w:tcBorders>
             <w:shd w:fill="EDF3F6"/>
           </w:tcPr>
           <w:p>

</xml_diff>